<commit_message>
update docs on Tue, Sep 15, 2026  11:38:19 PM
</commit_message>
<xml_diff>
--- a/Database Management/database_management.docx
+++ b/Database Management/database_management.docx
@@ -1,6 +1,6 @@
 
 <file path=word/document.xml><?xml version="1.0" encoding="utf-8"?>
-<w:document xmlns:wpc="http://schemas.microsoft.com/office/word/2010/wordprocessingCanvas" xmlns:cx="http://schemas.microsoft.com/office/drawing/2014/chartex" xmlns:cx1="http://schemas.microsoft.com/office/drawing/2015/9/8/chartex" xmlns:cx2="http://schemas.microsoft.com/office/drawing/2015/10/21/chartex" xmlns:cx3="http://schemas.microsoft.com/office/drawing/2016/5/9/chartex" xmlns:cx4="http://schemas.microsoft.com/office/drawing/2016/5/10/chartex" xmlns:cx5="http://schemas.microsoft.com/office/drawing/2016/5/11/chartex" xmlns:cx6="http://schemas.microsoft.com/office/drawing/2016/5/12/chartex" xmlns:cx7="http://schemas.microsoft.com/office/drawing/2016/5/13/chartex" xmlns:cx8="http://schemas.microsoft.com/office/drawing/2016/5/14/chartex" xmlns:mc="http://schemas.openxmlformats.org/markup-compatibility/2006" xmlns:m="http://schemas.openxmlformats.org/officeDocument/2006/math" xmlns:aink="http://schemas.microsoft.com/office/drawing/2016/ink" xmlns:am3d="http://schemas.microsoft.com/office/drawing/2017/model3d" xmlns:oel="http://schemas.microsoft.com/office/2019/extlst" xmlns:r="http://schemas.openxmlformats.org/officeDocument/2006/relationships" xmlns:wp14="http://schemas.microsoft.com/office/word/2010/wordprocessingDrawing" xmlns:wp="http://schemas.openxmlformats.org/drawingml/2006/wordprocessingDrawing" xmlns:wpg="http://schemas.microsoft.com/office/word/2010/wordprocessingGroup" xmlns:wpi="http://schemas.microsoft.com/office/word/2010/wordprocessingInk" xmlns:wps="http://schemas.microsoft.com/office/word/2010/wordprocessingShape" xmlns:o="urn:schemas-microsoft-com:office:office" xmlns:v="urn:schemas-microsoft-com:vml" xmlns:w10="urn:schemas-microsoft-com:office:word" xmlns:w="http://schemas.openxmlformats.org/wordprocessingml/2006/main" xmlns:w14="http://schemas.microsoft.com/office/word/2010/wordml" xmlns:w15="http://schemas.microsoft.com/office/word/2012/wordml" xmlns:w16cei="http://schemas.microsoft.com/office/word/2026/wordml/cei" xmlns:w16cex="http://schemas.microsoft.com/office/word/2018/wordml/cex" xmlns:w16cid="http://schemas.microsoft.com/office/word/2016/wordml/cid" xmlns:w16="http://schemas.microsoft.com/office/word/2018/wordml" xmlns:w16sdtdh="http://schemas.microsoft.com/office/word/2020/wordml/sdtdatahash" xmlns:w16sdtfl="http://schemas.microsoft.com/office/word/2024/wordml/sdtformatlock" xmlns:w16se="http://schemas.microsoft.com/office/word/2015/wordml/symex" xmlns:w16du="http://schemas.microsoft.com/office/word/2023/wordml/word16du" xmlns:wne="http://schemas.microsoft.com/office/word/2006/wordml" mc:Ignorable="w14 w15 w16se w16cid w16 w16cex w16sdtdh w16sdtfl w16du wp14">
+<w:document xmlns:wpc="http://schemas.microsoft.com/office/word/2010/wordprocessingCanvas" xmlns:cx="http://schemas.microsoft.com/office/drawing/2014/chartex" xmlns:cx1="http://schemas.microsoft.com/office/drawing/2015/9/8/chartex" xmlns:cx2="http://schemas.microsoft.com/office/drawing/2015/10/21/chartex" xmlns:cx3="http://schemas.microsoft.com/office/drawing/2016/5/9/chartex" xmlns:cx4="http://schemas.microsoft.com/office/drawing/2016/5/10/chartex" xmlns:cx5="http://schemas.microsoft.com/office/drawing/2016/5/11/chartex" xmlns:cx6="http://schemas.microsoft.com/office/drawing/2016/5/12/chartex" xmlns:cx7="http://schemas.microsoft.com/office/drawing/2016/5/13/chartex" xmlns:cx8="http://schemas.microsoft.com/office/drawing/2016/5/14/chartex" xmlns:mc="http://schemas.openxmlformats.org/markup-compatibility/2006" xmlns:aink="http://schemas.microsoft.com/office/drawing/2016/ink" xmlns:am3d="http://schemas.microsoft.com/office/drawing/2017/model3d" xmlns:o="urn:schemas-microsoft-com:office:office" xmlns:oel="http://schemas.microsoft.com/office/2019/extlst" xmlns:r="http://schemas.openxmlformats.org/officeDocument/2006/relationships" xmlns:m="http://schemas.openxmlformats.org/officeDocument/2006/math" xmlns:v="urn:schemas-microsoft-com:vml" xmlns:wp14="http://schemas.microsoft.com/office/word/2010/wordprocessingDrawing" xmlns:wp="http://schemas.openxmlformats.org/drawingml/2006/wordprocessingDrawing" xmlns:w10="urn:schemas-microsoft-com:office:word" xmlns:w="http://schemas.openxmlformats.org/wordprocessingml/2006/main" xmlns:w14="http://schemas.microsoft.com/office/word/2010/wordml" xmlns:w15="http://schemas.microsoft.com/office/word/2012/wordml" xmlns:w16cei="http://schemas.microsoft.com/office/word/2026/wordml/cei" xmlns:w16cex="http://schemas.microsoft.com/office/word/2018/wordml/cex" xmlns:w16cid="http://schemas.microsoft.com/office/word/2016/wordml/cid" xmlns:w16="http://schemas.microsoft.com/office/word/2018/wordml" xmlns:w16du="http://schemas.microsoft.com/office/word/2023/wordml/word16du" xmlns:w16sdtdh="http://schemas.microsoft.com/office/word/2020/wordml/sdtdatahash" xmlns:w16sdtfl="http://schemas.microsoft.com/office/word/2024/wordml/sdtformatlock" xmlns:w16se="http://schemas.microsoft.com/office/word/2015/wordml/symex" xmlns:wpg="http://schemas.microsoft.com/office/word/2010/wordprocessingGroup" xmlns:wpi="http://schemas.microsoft.com/office/word/2010/wordprocessingInk" xmlns:wne="http://schemas.microsoft.com/office/word/2006/wordml" xmlns:wps="http://schemas.microsoft.com/office/word/2010/wordprocessingShape" mc:Ignorable="w14 w15 w16se w16cid w16 w16cex w16sdtdh w16sdtfl w16du wp14">
   <w:body>
     <w:sdt>
       <w:sdtPr>
@@ -3854,10 +3854,18 @@
         <w:t>key. It</w:t>
       </w:r>
       <w:r>
-        <w:t xml:space="preserve"> can have single attribute or multiple attributes which can be </w:t>
+        <w:t xml:space="preserve"> can have single </w:t>
       </w:r>
       <w:proofErr w:type="gramStart"/>
       <w:r>
+        <w:t>attribute</w:t>
+      </w:r>
+      <w:proofErr w:type="gramEnd"/>
+      <w:r>
+        <w:t xml:space="preserve"> or multiple attributes which can be </w:t>
+      </w:r>
+      <w:proofErr w:type="gramStart"/>
+      <w:r>
         <w:t>combined together</w:t>
       </w:r>
       <w:proofErr w:type="gramEnd"/>
@@ -4108,7 +4116,15 @@
       </w:r>
       <w:proofErr w:type="gramEnd"/>
       <w:r>
-        <w:t xml:space="preserve"> any permutation and combination (PNC) of the keys or attributes in a relation or a table can qualifies a</w:t>
+        <w:t xml:space="preserve"> any permutation and combination (PNC) of the keys or attributes in a relation or a table can </w:t>
+      </w:r>
+      <w:proofErr w:type="gramStart"/>
+      <w:r>
+        <w:t>qualifies</w:t>
+      </w:r>
+      <w:proofErr w:type="gramEnd"/>
+      <w:r>
+        <w:t xml:space="preserve"> a</w:t>
       </w:r>
       <w:r>
         <w:t xml:space="preserve">s a </w:t>
@@ -4253,11 +4269,19 @@
       </w:r>
       <w:proofErr w:type="spellStart"/>
       <w:r>
-        <w:t>stud_address</w:t>
+        <w:t>stud_</w:t>
+      </w:r>
+      <w:proofErr w:type="gramStart"/>
+      <w:r>
+        <w:t>address</w:t>
       </w:r>
       <w:proofErr w:type="spellEnd"/>
       <w:r>
-        <w:t xml:space="preserve">} (this is one of the candidate keys) </w:t>
+        <w:t>} (</w:t>
+      </w:r>
+      <w:proofErr w:type="gramEnd"/>
+      <w:r>
+        <w:t xml:space="preserve">this is one of the candidate keys) </w:t>
       </w:r>
     </w:p>
     <w:p>
@@ -6994,7 +7018,15 @@
         <w:t xml:space="preserve"> C2-&gt;C1 holds good too</w:t>
       </w:r>
       <w:r>
-        <w:t>, as both C1 and C2 are having unique values.</w:t>
+        <w:t xml:space="preserve">, as both C1 and C2 </w:t>
+      </w:r>
+      <w:proofErr w:type="gramStart"/>
+      <w:r>
+        <w:t>are having</w:t>
+      </w:r>
+      <w:proofErr w:type="gramEnd"/>
+      <w:r>
+        <w:t xml:space="preserve"> unique values.</w:t>
       </w:r>
     </w:p>
     <w:p>
@@ -10943,7 +10975,15 @@
     </w:p>
     <w:p>
       <w:r>
-        <w:t xml:space="preserve">So here the primary key combination of </w:t>
+        <w:t xml:space="preserve">So here </w:t>
+      </w:r>
+      <w:proofErr w:type="gramStart"/>
+      <w:r>
+        <w:t>the</w:t>
+      </w:r>
+      <w:proofErr w:type="gramEnd"/>
+      <w:r>
+        <w:t xml:space="preserve"> primary key combination of </w:t>
       </w:r>
       <w:proofErr w:type="gramStart"/>
       <w:r>
@@ -19382,12 +19422,70 @@
           </w:tcPr>
           <w:p>
             <w:r>
-              <w:t>null</w:t>
+              <w:t>N</w:t>
+            </w:r>
+            <w:r>
+              <w:t>ull</w:t>
             </w:r>
           </w:p>
         </w:tc>
       </w:tr>
     </w:tbl>
+    <w:p/>
+    <w:p>
+      <w:pPr>
+        <w:pStyle w:val="Heading3"/>
+      </w:pPr>
+      <w:r>
+        <w:t>Find 2</w:t>
+      </w:r>
+      <w:r>
+        <w:rPr>
+          <w:vertAlign w:val="superscript"/>
+        </w:rPr>
+        <w:t>nd</w:t>
+      </w:r>
+      <w:r>
+        <w:t xml:space="preserve"> highest salary.</w:t>
+      </w:r>
+    </w:p>
+    <w:p/>
+    <w:p>
+      <w:r>
+        <w:t xml:space="preserve">SELECT </w:t>
+      </w:r>
+      <w:proofErr w:type="gramStart"/>
+      <w:r>
+        <w:t>MAX(</w:t>
+      </w:r>
+      <w:proofErr w:type="gramEnd"/>
+      <w:r>
+        <w:t xml:space="preserve">salary) AS </w:t>
+      </w:r>
+      <w:proofErr w:type="spellStart"/>
+      <w:r>
+        <w:t>second_highest_salary</w:t>
+      </w:r>
+      <w:proofErr w:type="spellEnd"/>
+    </w:p>
+    <w:p>
+      <w:r>
+        <w:t>FROM employees</w:t>
+      </w:r>
+    </w:p>
+    <w:p>
+      <w:r>
+        <w:t xml:space="preserve">WHERE salary &lt; (SELECT </w:t>
+      </w:r>
+      <w:proofErr w:type="gramStart"/>
+      <w:r>
+        <w:t>MAX(</w:t>
+      </w:r>
+      <w:proofErr w:type="gramEnd"/>
+      <w:r>
+        <w:t>salary) FROM employees);</w:t>
+      </w:r>
+    </w:p>
     <w:p/>
     <w:p>
       <w:pPr>
@@ -20637,6 +20735,7 @@
                 <w:rFonts w:ascii="Aptos" w:hAnsi="Aptos"/>
                 <w:color w:val="4D4D4D"/>
               </w:rPr>
+              <w:lastRenderedPageBreak/>
               <w:t>5</w:t>
             </w:r>
           </w:p>
@@ -21199,7 +21298,6 @@
         <w:rPr>
           <w:rFonts w:ascii="Aptos" w:hAnsi="Aptos"/>
         </w:rPr>
-        <w:lastRenderedPageBreak/>
         <w:t> </w:t>
       </w:r>
     </w:p>
@@ -23302,6 +23400,7 @@
                 <w:rFonts w:ascii="Aptos" w:hAnsi="Aptos"/>
                 <w:color w:val="4D4D4D"/>
               </w:rPr>
+              <w:lastRenderedPageBreak/>
               <w:t>101</w:t>
             </w:r>
           </w:p>
@@ -25618,6 +25717,7 @@
                 <w:rFonts w:ascii="Aptos" w:hAnsi="Aptos"/>
                 <w:color w:val="4D4D4D"/>
               </w:rPr>
+              <w:lastRenderedPageBreak/>
               <w:t>5</w:t>
             </w:r>
           </w:p>
@@ -26170,7 +26270,6 @@
                 <w:rFonts w:ascii="Aptos" w:hAnsi="Aptos"/>
                 <w:color w:val="4D4D4D"/>
               </w:rPr>
-              <w:lastRenderedPageBreak/>
               <w:t>9</w:t>
             </w:r>
           </w:p>
@@ -28262,6 +28361,7 @@
                 <w:rFonts w:ascii="Aptos" w:hAnsi="Aptos"/>
                 <w:color w:val="4D4D4D"/>
               </w:rPr>
+              <w:lastRenderedPageBreak/>
               <w:t>102</w:t>
             </w:r>
           </w:p>
@@ -29108,12 +29208,12 @@
         <w:tblDescription w:val=""/>
       </w:tblPr>
       <w:tblGrid>
-        <w:gridCol w:w="991"/>
-        <w:gridCol w:w="1418"/>
         <w:gridCol w:w="988"/>
-        <w:gridCol w:w="1818"/>
-        <w:gridCol w:w="1818"/>
-        <w:gridCol w:w="1356"/>
+        <w:gridCol w:w="1329"/>
+        <w:gridCol w:w="988"/>
+        <w:gridCol w:w="1655"/>
+        <w:gridCol w:w="1655"/>
+        <w:gridCol w:w="1195"/>
       </w:tblGrid>
       <w:tr>
         <w:tc>
@@ -30826,6 +30926,7 @@
           <w:rFonts w:ascii="Aptos" w:hAnsi="Aptos"/>
           <w:color w:val="C18EE3"/>
         </w:rPr>
+        <w:lastRenderedPageBreak/>
         <w:t>FROM</w:t>
       </w:r>
       <w:r>
@@ -31399,7 +31500,6 @@
                 <w:sz w:val="20"/>
                 <w:szCs w:val="20"/>
               </w:rPr>
-              <w:lastRenderedPageBreak/>
               <w:t>emp_id</w:t>
             </w:r>
             <w:proofErr w:type="spellEnd"/>
@@ -33773,6 +33873,7 @@
           <w:rFonts w:ascii="Aptos" w:hAnsi="Aptos"/>
           <w:color w:val="C18EE3"/>
         </w:rPr>
+        <w:lastRenderedPageBreak/>
         <w:t>FROM</w:t>
       </w:r>
       <w:r>
@@ -34048,7 +34149,6 @@
                 <w:rFonts w:ascii="Aptos" w:hAnsi="Aptos"/>
                 <w:color w:val="4D4D4D"/>
               </w:rPr>
-              <w:lastRenderedPageBreak/>
               <w:t>101</w:t>
             </w:r>
           </w:p>
@@ -35628,6 +35728,7 @@
           <w:rFonts w:ascii="Aptos" w:hAnsi="Aptos"/>
           <w:color w:val="67A6BF"/>
         </w:rPr>
+        <w:lastRenderedPageBreak/>
         <w:t xml:space="preserve">( </w:t>
       </w:r>
     </w:p>
@@ -35902,9 +36003,9 @@
         <w:tblDescription w:val=""/>
       </w:tblPr>
       <w:tblGrid>
-        <w:gridCol w:w="1818"/>
-        <w:gridCol w:w="2244"/>
-        <w:gridCol w:w="1418"/>
+        <w:gridCol w:w="1655"/>
+        <w:gridCol w:w="2002"/>
+        <w:gridCol w:w="1276"/>
       </w:tblGrid>
       <w:tr>
         <w:tc>
@@ -37335,6 +37436,7 @@
           <w:rFonts w:ascii="Aptos" w:hAnsi="Aptos"/>
           <w:color w:val="67A6BF"/>
         </w:rPr>
+        <w:lastRenderedPageBreak/>
         <w:t>(</w:t>
       </w:r>
       <w:r>
@@ -37840,7 +37942,6 @@
                 <w:rFonts w:ascii="Aptos" w:hAnsi="Aptos"/>
                 <w:color w:val="4D4D4D"/>
               </w:rPr>
-              <w:lastRenderedPageBreak/>
               <w:t>1</w:t>
             </w:r>
           </w:p>
@@ -39367,6 +39468,7 @@
         <w:t xml:space="preserve"> </w:t>
       </w:r>
       <w:proofErr w:type="spellStart"/>
+      <w:proofErr w:type="gramStart"/>
       <w:r>
         <w:rPr>
           <w:rFonts w:ascii="Aptos" w:hAnsi="Aptos"/>
@@ -39374,6 +39476,7 @@
         <w:t>cols</w:t>
       </w:r>
       <w:proofErr w:type="spellEnd"/>
+      <w:proofErr w:type="gramEnd"/>
       <w:r>
         <w:rPr>
           <w:rFonts w:ascii="Aptos" w:hAnsi="Aptos"/>
@@ -39817,6 +39920,7 @@
                 <w:bCs/>
                 <w:color w:val="4D4D4D"/>
               </w:rPr>
+              <w:lastRenderedPageBreak/>
               <w:t>emp_name</w:t>
             </w:r>
             <w:proofErr w:type="spellEnd"/>
@@ -40463,7 +40567,6 @@
         <w:rPr>
           <w:rFonts w:ascii="Aptos" w:hAnsi="Aptos"/>
         </w:rPr>
-        <w:lastRenderedPageBreak/>
         <w:t> </w:t>
       </w:r>
     </w:p>
@@ -41325,6 +41428,7 @@
                 <w:bCs/>
                 <w:color w:val="4D4D4D"/>
               </w:rPr>
+              <w:lastRenderedPageBreak/>
               <w:t>employee_id</w:t>
             </w:r>
             <w:proofErr w:type="spellEnd"/>
@@ -42234,7 +42338,7 @@
 </file>
 
 <file path=word/endnotes.xml><?xml version="1.0" encoding="utf-8"?>
-<w:endnotes xmlns:wpc="http://schemas.microsoft.com/office/word/2010/wordprocessingCanvas" xmlns:cx="http://schemas.microsoft.com/office/drawing/2014/chartex" xmlns:cx1="http://schemas.microsoft.com/office/drawing/2015/9/8/chartex" xmlns:cx2="http://schemas.microsoft.com/office/drawing/2015/10/21/chartex" xmlns:cx3="http://schemas.microsoft.com/office/drawing/2016/5/9/chartex" xmlns:cx4="http://schemas.microsoft.com/office/drawing/2016/5/10/chartex" xmlns:cx5="http://schemas.microsoft.com/office/drawing/2016/5/11/chartex" xmlns:cx6="http://schemas.microsoft.com/office/drawing/2016/5/12/chartex" xmlns:cx7="http://schemas.microsoft.com/office/drawing/2016/5/13/chartex" xmlns:cx8="http://schemas.microsoft.com/office/drawing/2016/5/14/chartex" xmlns:mc="http://schemas.openxmlformats.org/markup-compatibility/2006" xmlns:m="http://schemas.openxmlformats.org/officeDocument/2006/math" xmlns:aink="http://schemas.microsoft.com/office/drawing/2016/ink" xmlns:am3d="http://schemas.microsoft.com/office/drawing/2017/model3d" xmlns:oel="http://schemas.microsoft.com/office/2019/extlst" xmlns:r="http://schemas.openxmlformats.org/officeDocument/2006/relationships" xmlns:wp14="http://schemas.microsoft.com/office/word/2010/wordprocessingDrawing" xmlns:wp="http://schemas.openxmlformats.org/drawingml/2006/wordprocessingDrawing" xmlns:wpg="http://schemas.microsoft.com/office/word/2010/wordprocessingGroup" xmlns:wpi="http://schemas.microsoft.com/office/word/2010/wordprocessingInk" xmlns:wps="http://schemas.microsoft.com/office/word/2010/wordprocessingShape" xmlns:o="urn:schemas-microsoft-com:office:office" xmlns:v="urn:schemas-microsoft-com:vml" xmlns:w10="urn:schemas-microsoft-com:office:word" xmlns:w="http://schemas.openxmlformats.org/wordprocessingml/2006/main" xmlns:w14="http://schemas.microsoft.com/office/word/2010/wordml" xmlns:w15="http://schemas.microsoft.com/office/word/2012/wordml" xmlns:w16cei="http://schemas.microsoft.com/office/word/2026/wordml/cei" xmlns:w16cex="http://schemas.microsoft.com/office/word/2018/wordml/cex" xmlns:w16cid="http://schemas.microsoft.com/office/word/2016/wordml/cid" xmlns:w16="http://schemas.microsoft.com/office/word/2018/wordml" xmlns:w16sdtdh="http://schemas.microsoft.com/office/word/2020/wordml/sdtdatahash" xmlns:w16sdtfl="http://schemas.microsoft.com/office/word/2024/wordml/sdtformatlock" xmlns:w16se="http://schemas.microsoft.com/office/word/2015/wordml/symex" xmlns:w16du="http://schemas.microsoft.com/office/word/2023/wordml/word16du" xmlns:wne="http://schemas.microsoft.com/office/word/2006/wordml" mc:Ignorable="w14 w15 w16se w16cid w16 w16cex w16sdtdh w16sdtfl w16du wp14">
+<w:endnotes xmlns:wpc="http://schemas.microsoft.com/office/word/2010/wordprocessingCanvas" xmlns:cx="http://schemas.microsoft.com/office/drawing/2014/chartex" xmlns:cx1="http://schemas.microsoft.com/office/drawing/2015/9/8/chartex" xmlns:cx2="http://schemas.microsoft.com/office/drawing/2015/10/21/chartex" xmlns:cx3="http://schemas.microsoft.com/office/drawing/2016/5/9/chartex" xmlns:cx4="http://schemas.microsoft.com/office/drawing/2016/5/10/chartex" xmlns:cx5="http://schemas.microsoft.com/office/drawing/2016/5/11/chartex" xmlns:cx6="http://schemas.microsoft.com/office/drawing/2016/5/12/chartex" xmlns:cx7="http://schemas.microsoft.com/office/drawing/2016/5/13/chartex" xmlns:cx8="http://schemas.microsoft.com/office/drawing/2016/5/14/chartex" xmlns:mc="http://schemas.openxmlformats.org/markup-compatibility/2006" xmlns:aink="http://schemas.microsoft.com/office/drawing/2016/ink" xmlns:am3d="http://schemas.microsoft.com/office/drawing/2017/model3d" xmlns:o="urn:schemas-microsoft-com:office:office" xmlns:oel="http://schemas.microsoft.com/office/2019/extlst" xmlns:r="http://schemas.openxmlformats.org/officeDocument/2006/relationships" xmlns:m="http://schemas.openxmlformats.org/officeDocument/2006/math" xmlns:v="urn:schemas-microsoft-com:vml" xmlns:wp14="http://schemas.microsoft.com/office/word/2010/wordprocessingDrawing" xmlns:wp="http://schemas.openxmlformats.org/drawingml/2006/wordprocessingDrawing" xmlns:w10="urn:schemas-microsoft-com:office:word" xmlns:w="http://schemas.openxmlformats.org/wordprocessingml/2006/main" xmlns:w14="http://schemas.microsoft.com/office/word/2010/wordml" xmlns:w15="http://schemas.microsoft.com/office/word/2012/wordml" xmlns:w16cei="http://schemas.microsoft.com/office/word/2026/wordml/cei" xmlns:w16cex="http://schemas.microsoft.com/office/word/2018/wordml/cex" xmlns:w16cid="http://schemas.microsoft.com/office/word/2016/wordml/cid" xmlns:w16="http://schemas.microsoft.com/office/word/2018/wordml" xmlns:w16du="http://schemas.microsoft.com/office/word/2023/wordml/word16du" xmlns:w16sdtdh="http://schemas.microsoft.com/office/word/2020/wordml/sdtdatahash" xmlns:w16sdtfl="http://schemas.microsoft.com/office/word/2024/wordml/sdtformatlock" xmlns:w16se="http://schemas.microsoft.com/office/word/2015/wordml/symex" xmlns:wpg="http://schemas.microsoft.com/office/word/2010/wordprocessingGroup" xmlns:wpi="http://schemas.microsoft.com/office/word/2010/wordprocessingInk" xmlns:wne="http://schemas.microsoft.com/office/word/2006/wordml" xmlns:wps="http://schemas.microsoft.com/office/word/2010/wordprocessingShape" mc:Ignorable="w14 w15 w16se w16cid w16 w16cex w16sdtdh w16sdtfl w16du wp14">
   <w:endnote w:type="separator" w:id="-1">
     <w:p>
       <w:r>
@@ -42253,7 +42357,7 @@
 </file>
 
 <file path=word/footnotes.xml><?xml version="1.0" encoding="utf-8"?>
-<w:footnotes xmlns:wpc="http://schemas.microsoft.com/office/word/2010/wordprocessingCanvas" xmlns:cx="http://schemas.microsoft.com/office/drawing/2014/chartex" xmlns:cx1="http://schemas.microsoft.com/office/drawing/2015/9/8/chartex" xmlns:cx2="http://schemas.microsoft.com/office/drawing/2015/10/21/chartex" xmlns:cx3="http://schemas.microsoft.com/office/drawing/2016/5/9/chartex" xmlns:cx4="http://schemas.microsoft.com/office/drawing/2016/5/10/chartex" xmlns:cx5="http://schemas.microsoft.com/office/drawing/2016/5/11/chartex" xmlns:cx6="http://schemas.microsoft.com/office/drawing/2016/5/12/chartex" xmlns:cx7="http://schemas.microsoft.com/office/drawing/2016/5/13/chartex" xmlns:cx8="http://schemas.microsoft.com/office/drawing/2016/5/14/chartex" xmlns:mc="http://schemas.openxmlformats.org/markup-compatibility/2006" xmlns:m="http://schemas.openxmlformats.org/officeDocument/2006/math" xmlns:aink="http://schemas.microsoft.com/office/drawing/2016/ink" xmlns:am3d="http://schemas.microsoft.com/office/drawing/2017/model3d" xmlns:oel="http://schemas.microsoft.com/office/2019/extlst" xmlns:r="http://schemas.openxmlformats.org/officeDocument/2006/relationships" xmlns:wp14="http://schemas.microsoft.com/office/word/2010/wordprocessingDrawing" xmlns:wp="http://schemas.openxmlformats.org/drawingml/2006/wordprocessingDrawing" xmlns:wpg="http://schemas.microsoft.com/office/word/2010/wordprocessingGroup" xmlns:wpi="http://schemas.microsoft.com/office/word/2010/wordprocessingInk" xmlns:wps="http://schemas.microsoft.com/office/word/2010/wordprocessingShape" xmlns:o="urn:schemas-microsoft-com:office:office" xmlns:v="urn:schemas-microsoft-com:vml" xmlns:w10="urn:schemas-microsoft-com:office:word" xmlns:w="http://schemas.openxmlformats.org/wordprocessingml/2006/main" xmlns:w14="http://schemas.microsoft.com/office/word/2010/wordml" xmlns:w15="http://schemas.microsoft.com/office/word/2012/wordml" xmlns:w16cei="http://schemas.microsoft.com/office/word/2026/wordml/cei" xmlns:w16cex="http://schemas.microsoft.com/office/word/2018/wordml/cex" xmlns:w16cid="http://schemas.microsoft.com/office/word/2016/wordml/cid" xmlns:w16="http://schemas.microsoft.com/office/word/2018/wordml" xmlns:w16sdtdh="http://schemas.microsoft.com/office/word/2020/wordml/sdtdatahash" xmlns:w16sdtfl="http://schemas.microsoft.com/office/word/2024/wordml/sdtformatlock" xmlns:w16se="http://schemas.microsoft.com/office/word/2015/wordml/symex" xmlns:w16du="http://schemas.microsoft.com/office/word/2023/wordml/word16du" xmlns:wne="http://schemas.microsoft.com/office/word/2006/wordml" mc:Ignorable="w14 w15 w16se w16cid w16 w16cex w16sdtdh w16sdtfl w16du wp14">
+<w:footnotes xmlns:wpc="http://schemas.microsoft.com/office/word/2010/wordprocessingCanvas" xmlns:cx="http://schemas.microsoft.com/office/drawing/2014/chartex" xmlns:cx1="http://schemas.microsoft.com/office/drawing/2015/9/8/chartex" xmlns:cx2="http://schemas.microsoft.com/office/drawing/2015/10/21/chartex" xmlns:cx3="http://schemas.microsoft.com/office/drawing/2016/5/9/chartex" xmlns:cx4="http://schemas.microsoft.com/office/drawing/2016/5/10/chartex" xmlns:cx5="http://schemas.microsoft.com/office/drawing/2016/5/11/chartex" xmlns:cx6="http://schemas.microsoft.com/office/drawing/2016/5/12/chartex" xmlns:cx7="http://schemas.microsoft.com/office/drawing/2016/5/13/chartex" xmlns:cx8="http://schemas.microsoft.com/office/drawing/2016/5/14/chartex" xmlns:mc="http://schemas.openxmlformats.org/markup-compatibility/2006" xmlns:aink="http://schemas.microsoft.com/office/drawing/2016/ink" xmlns:am3d="http://schemas.microsoft.com/office/drawing/2017/model3d" xmlns:o="urn:schemas-microsoft-com:office:office" xmlns:oel="http://schemas.microsoft.com/office/2019/extlst" xmlns:r="http://schemas.openxmlformats.org/officeDocument/2006/relationships" xmlns:m="http://schemas.openxmlformats.org/officeDocument/2006/math" xmlns:v="urn:schemas-microsoft-com:vml" xmlns:wp14="http://schemas.microsoft.com/office/word/2010/wordprocessingDrawing" xmlns:wp="http://schemas.openxmlformats.org/drawingml/2006/wordprocessingDrawing" xmlns:w10="urn:schemas-microsoft-com:office:word" xmlns:w="http://schemas.openxmlformats.org/wordprocessingml/2006/main" xmlns:w14="http://schemas.microsoft.com/office/word/2010/wordml" xmlns:w15="http://schemas.microsoft.com/office/word/2012/wordml" xmlns:w16cei="http://schemas.microsoft.com/office/word/2026/wordml/cei" xmlns:w16cex="http://schemas.microsoft.com/office/word/2018/wordml/cex" xmlns:w16cid="http://schemas.microsoft.com/office/word/2016/wordml/cid" xmlns:w16="http://schemas.microsoft.com/office/word/2018/wordml" xmlns:w16du="http://schemas.microsoft.com/office/word/2023/wordml/word16du" xmlns:w16sdtdh="http://schemas.microsoft.com/office/word/2020/wordml/sdtdatahash" xmlns:w16sdtfl="http://schemas.microsoft.com/office/word/2024/wordml/sdtformatlock" xmlns:w16se="http://schemas.microsoft.com/office/word/2015/wordml/symex" xmlns:wpg="http://schemas.microsoft.com/office/word/2010/wordprocessingGroup" xmlns:wpi="http://schemas.microsoft.com/office/word/2010/wordprocessingInk" xmlns:wne="http://schemas.microsoft.com/office/word/2006/wordml" xmlns:wps="http://schemas.microsoft.com/office/word/2010/wordprocessingShape" mc:Ignorable="w14 w15 w16se w16cid w16 w16cex w16sdtdh w16sdtfl w16du wp14">
   <w:footnote w:type="separator" w:id="-1">
     <w:p>
       <w:r>
@@ -42272,7 +42376,7 @@
 </file>
 
 <file path=word/numbering.xml><?xml version="1.0" encoding="utf-8"?>
-<w:numbering xmlns:wpc="http://schemas.microsoft.com/office/word/2010/wordprocessingCanvas" xmlns:cx="http://schemas.microsoft.com/office/drawing/2014/chartex" xmlns:cx1="http://schemas.microsoft.com/office/drawing/2015/9/8/chartex" xmlns:cx2="http://schemas.microsoft.com/office/drawing/2015/10/21/chartex" xmlns:cx3="http://schemas.microsoft.com/office/drawing/2016/5/9/chartex" xmlns:cx4="http://schemas.microsoft.com/office/drawing/2016/5/10/chartex" xmlns:cx5="http://schemas.microsoft.com/office/drawing/2016/5/11/chartex" xmlns:cx6="http://schemas.microsoft.com/office/drawing/2016/5/12/chartex" xmlns:cx7="http://schemas.microsoft.com/office/drawing/2016/5/13/chartex" xmlns:cx8="http://schemas.microsoft.com/office/drawing/2016/5/14/chartex" xmlns:mc="http://schemas.openxmlformats.org/markup-compatibility/2006" xmlns:m="http://schemas.openxmlformats.org/officeDocument/2006/math" xmlns:aink="http://schemas.microsoft.com/office/drawing/2016/ink" xmlns:am3d="http://schemas.microsoft.com/office/drawing/2017/model3d" xmlns:oel="http://schemas.microsoft.com/office/2019/extlst" xmlns:r="http://schemas.openxmlformats.org/officeDocument/2006/relationships" xmlns:wp14="http://schemas.microsoft.com/office/word/2010/wordprocessingDrawing" xmlns:wp="http://schemas.openxmlformats.org/drawingml/2006/wordprocessingDrawing" xmlns:wpg="http://schemas.microsoft.com/office/word/2010/wordprocessingGroup" xmlns:wpi="http://schemas.microsoft.com/office/word/2010/wordprocessingInk" xmlns:wps="http://schemas.microsoft.com/office/word/2010/wordprocessingShape" xmlns:o="urn:schemas-microsoft-com:office:office" xmlns:v="urn:schemas-microsoft-com:vml" xmlns:w10="urn:schemas-microsoft-com:office:word" xmlns:w="http://schemas.openxmlformats.org/wordprocessingml/2006/main" xmlns:w14="http://schemas.microsoft.com/office/word/2010/wordml" xmlns:w15="http://schemas.microsoft.com/office/word/2012/wordml" xmlns:w16cei="http://schemas.microsoft.com/office/word/2026/wordml/cei" xmlns:w16cex="http://schemas.microsoft.com/office/word/2018/wordml/cex" xmlns:w16cid="http://schemas.microsoft.com/office/word/2016/wordml/cid" xmlns:w16="http://schemas.microsoft.com/office/word/2018/wordml" xmlns:w16sdtdh="http://schemas.microsoft.com/office/word/2020/wordml/sdtdatahash" xmlns:w16sdtfl="http://schemas.microsoft.com/office/word/2024/wordml/sdtformatlock" xmlns:w16se="http://schemas.microsoft.com/office/word/2015/wordml/symex" xmlns:w16du="http://schemas.microsoft.com/office/word/2023/wordml/word16du" xmlns:wne="http://schemas.microsoft.com/office/word/2006/wordml" mc:Ignorable="w14 w15 w16se w16cid w16 w16cex w16sdtdh w16sdtfl w16du wp14">
+<w:numbering xmlns:wpc="http://schemas.microsoft.com/office/word/2010/wordprocessingCanvas" xmlns:cx="http://schemas.microsoft.com/office/drawing/2014/chartex" xmlns:cx1="http://schemas.microsoft.com/office/drawing/2015/9/8/chartex" xmlns:cx2="http://schemas.microsoft.com/office/drawing/2015/10/21/chartex" xmlns:cx3="http://schemas.microsoft.com/office/drawing/2016/5/9/chartex" xmlns:cx4="http://schemas.microsoft.com/office/drawing/2016/5/10/chartex" xmlns:cx5="http://schemas.microsoft.com/office/drawing/2016/5/11/chartex" xmlns:cx6="http://schemas.microsoft.com/office/drawing/2016/5/12/chartex" xmlns:cx7="http://schemas.microsoft.com/office/drawing/2016/5/13/chartex" xmlns:cx8="http://schemas.microsoft.com/office/drawing/2016/5/14/chartex" xmlns:mc="http://schemas.openxmlformats.org/markup-compatibility/2006" xmlns:aink="http://schemas.microsoft.com/office/drawing/2016/ink" xmlns:am3d="http://schemas.microsoft.com/office/drawing/2017/model3d" xmlns:o="urn:schemas-microsoft-com:office:office" xmlns:oel="http://schemas.microsoft.com/office/2019/extlst" xmlns:r="http://schemas.openxmlformats.org/officeDocument/2006/relationships" xmlns:m="http://schemas.openxmlformats.org/officeDocument/2006/math" xmlns:v="urn:schemas-microsoft-com:vml" xmlns:wp14="http://schemas.microsoft.com/office/word/2010/wordprocessingDrawing" xmlns:wp="http://schemas.openxmlformats.org/drawingml/2006/wordprocessingDrawing" xmlns:w10="urn:schemas-microsoft-com:office:word" xmlns:w="http://schemas.openxmlformats.org/wordprocessingml/2006/main" xmlns:w14="http://schemas.microsoft.com/office/word/2010/wordml" xmlns:w15="http://schemas.microsoft.com/office/word/2012/wordml" xmlns:w16cei="http://schemas.microsoft.com/office/word/2026/wordml/cei" xmlns:w16cex="http://schemas.microsoft.com/office/word/2018/wordml/cex" xmlns:w16cid="http://schemas.microsoft.com/office/word/2016/wordml/cid" xmlns:w16="http://schemas.microsoft.com/office/word/2018/wordml" xmlns:w16du="http://schemas.microsoft.com/office/word/2023/wordml/word16du" xmlns:w16sdtdh="http://schemas.microsoft.com/office/word/2020/wordml/sdtdatahash" xmlns:w16sdtfl="http://schemas.microsoft.com/office/word/2024/wordml/sdtformatlock" xmlns:w16se="http://schemas.microsoft.com/office/word/2015/wordml/symex" xmlns:wpg="http://schemas.microsoft.com/office/word/2010/wordprocessingGroup" xmlns:wpi="http://schemas.microsoft.com/office/word/2010/wordprocessingInk" xmlns:wne="http://schemas.microsoft.com/office/word/2006/wordml" xmlns:wps="http://schemas.microsoft.com/office/word/2010/wordprocessingShape" mc:Ignorable="w14 w15 w16se w16cid w16 w16cex w16sdtdh w16sdtfl w16du wp14">
   <w:abstractNum w:abstractNumId="0" w15:restartNumberingAfterBreak="0">
     <w:nsid w:val="17D1689E"/>
     <w:multiLevelType w:val="hybridMultilevel"/>
@@ -44408,7 +44512,7 @@
 </file>
 
 <file path=word/styles.xml><?xml version="1.0" encoding="utf-8"?>
-<w:styles xmlns:mc="http://schemas.openxmlformats.org/markup-compatibility/2006" xmlns:r="http://schemas.openxmlformats.org/officeDocument/2006/relationships" xmlns:w="http://schemas.openxmlformats.org/wordprocessingml/2006/main" xmlns:w14="http://schemas.microsoft.com/office/word/2010/wordml" xmlns:w15="http://schemas.microsoft.com/office/word/2012/wordml" xmlns:w16cex="http://schemas.microsoft.com/office/word/2018/wordml/cex" xmlns:w16cid="http://schemas.microsoft.com/office/word/2016/wordml/cid" xmlns:w16="http://schemas.microsoft.com/office/word/2018/wordml" xmlns:w16sdtdh="http://schemas.microsoft.com/office/word/2020/wordml/sdtdatahash" xmlns:w16sdtfl="http://schemas.microsoft.com/office/word/2024/wordml/sdtformatlock" xmlns:w16se="http://schemas.microsoft.com/office/word/2015/wordml/symex" xmlns:w16du="http://schemas.microsoft.com/office/word/2023/wordml/word16du" mc:Ignorable="w14 w15 w16se w16cid w16 w16cex w16sdtdh w16sdtfl w16du">
+<w:styles xmlns:mc="http://schemas.openxmlformats.org/markup-compatibility/2006" xmlns:r="http://schemas.openxmlformats.org/officeDocument/2006/relationships" xmlns:w="http://schemas.openxmlformats.org/wordprocessingml/2006/main" xmlns:w14="http://schemas.microsoft.com/office/word/2010/wordml" xmlns:w15="http://schemas.microsoft.com/office/word/2012/wordml" xmlns:w16cex="http://schemas.microsoft.com/office/word/2018/wordml/cex" xmlns:w16cid="http://schemas.microsoft.com/office/word/2016/wordml/cid" xmlns:w16="http://schemas.microsoft.com/office/word/2018/wordml" xmlns:w16du="http://schemas.microsoft.com/office/word/2023/wordml/word16du" xmlns:w16sdtdh="http://schemas.microsoft.com/office/word/2020/wordml/sdtdatahash" xmlns:w16sdtfl="http://schemas.microsoft.com/office/word/2024/wordml/sdtformatlock" xmlns:w16se="http://schemas.microsoft.com/office/word/2015/wordml/symex" mc:Ignorable="w14 w15 w16se w16cid w16 w16cex w16sdtdh w16sdtfl w16du">
   <w:docDefaults>
     <w:rPrDefault>
       <w:rPr>

</xml_diff>